<commit_message>
Rebuild the presentation guide's Word export
One of three, which is the point of the stamps. The other two guides did not
change for this release, so their exports still match their sources at 9cd7d0b
and were left alone; a rebuild of them would have been churn recording nothing.

Assisted-by: Claude Opus 5 <noreply@anthropic.com>
</commit_message>
<xml_diff>
--- a/presentation_guide.docx
+++ b/presentation_guide.docx
@@ -2,7 +2,7 @@
 <file path=word/document.xml><?xml version="1.0" encoding="utf-8"?>
 <w:document xmlns:w="http://schemas.openxmlformats.org/wordprocessingml/2006/main" xmlns:m="http://schemas.openxmlformats.org/officeDocument/2006/math" xmlns:r="http://schemas.openxmlformats.org/officeDocument/2006/relationships" xmlns:o="urn:schemas-microsoft-com:office:office" xmlns:v="urn:schemas-microsoft-com:vml" xmlns:w10="urn:schemas-microsoft-com:office:word" xmlns:a="http://schemas.openxmlformats.org/drawingml/2006/main" xmlns:pic="http://schemas.openxmlformats.org/drawingml/2006/picture" xmlns:wp="http://schemas.openxmlformats.org/drawingml/2006/wordprocessingDrawing">
   <w:body>
-    <w:bookmarkStart w:id="68" w:name="mlos-presentation-guide"/>
+    <w:bookmarkStart w:id="69" w:name="mlos-presentation-guide"/>
     <w:p>
       <w:pPr>
         <w:pStyle w:val="Heading1"/>
@@ -34,7 +34,7 @@
           <w:i/>
           <w:iCs/>
         </w:rPr>
-        <w:t xml:space="preserve">presentation guide, version 20260823_001. Read it in any markdown reader,</w:t>
+        <w:t xml:space="preserve">presentation guide, version 20260824_001. Read it in any markdown reader,</w:t>
       </w:r>
       <w:r>
         <w:rPr>
@@ -160,7 +160,7 @@
           <w:i/>
           <w:iCs/>
         </w:rPr>
-        <w:t xml:space="preserve">at commit 9cd7d0b (2026-08-23). Where that is not the newest commit touching the file, this Word copy is behind it.</w:t>
+        <w:t xml:space="preserve">at commit 570241c (2026-08-24). Where that is not the newest commit touching the file, this Word copy is behind it.</w:t>
       </w:r>
     </w:p>
     <w:p>
@@ -1914,7 +1914,7 @@
       </w:r>
     </w:p>
     <w:bookmarkEnd w:id="11"/>
-    <w:bookmarkStart w:id="18" w:name="producing-a-deck"/>
+    <w:bookmarkStart w:id="19" w:name="producing-a-deck"/>
     <w:p>
       <w:pPr>
         <w:pStyle w:val="Heading2"/>
@@ -1985,7 +1985,7 @@
         <w:t xml:space="preserve">is enough to look at what it produces.</w:t>
       </w:r>
     </w:p>
-    <w:bookmarkStart w:id="12" w:name="running-it-and-what-it-writes"/>
+    <w:bookmarkStart w:id="13" w:name="running-it-and-what-it-writes"/>
     <w:p>
       <w:pPr>
         <w:pStyle w:val="Heading3"/>
@@ -1997,6 +1997,52 @@
     <w:p>
       <w:pPr>
         <w:pStyle w:val="FirstParagraph"/>
+      </w:pPr>
+      <w:r>
+        <w:t xml:space="preserve">A deck built from the shipped OC2 settings is deposited at</w:t>
+      </w:r>
+      <w:r>
+        <w:t xml:space="preserve"> </w:t>
+      </w:r>
+      <w:hyperlink r:id="rId12">
+        <w:r>
+          <w:rPr>
+            <w:rStyle w:val="Hyperlink"/>
+          </w:rPr>
+          <w:t xml:space="preserve">10.5281/zenodo.22085157</w:t>
+        </w:r>
+      </w:hyperlink>
+      <w:r>
+        <w:t xml:space="preserve">, with its</w:t>
+      </w:r>
+      <w:r>
+        <w:t xml:space="preserve"> </w:t>
+      </w:r>
+      <w:r>
+        <w:t xml:space="preserve">table workbook, its figures, and the settings file it was built under, so the</w:t>
+      </w:r>
+      <w:r>
+        <w:t xml:space="preserve"> </w:t>
+      </w:r>
+      <w:r>
+        <w:t xml:space="preserve">output described below can be read without running anything. That deposit is</w:t>
+      </w:r>
+      <w:r>
+        <w:t xml:space="preserve"> </w:t>
+      </w:r>
+      <w:r>
+        <w:t xml:space="preserve">derived from the results deposit rather than standing on its own, and the</w:t>
+      </w:r>
+      <w:r>
+        <w:t xml:space="preserve"> </w:t>
+      </w:r>
+      <w:r>
+        <w:t xml:space="preserve">caveats above apply to it exactly as they apply to a deck built here.</w:t>
+      </w:r>
+    </w:p>
+    <w:p>
+      <w:pPr>
+        <w:pStyle w:val="BodyText"/>
       </w:pPr>
       <w:r>
         <w:t xml:space="preserve">After a normal analysis run, from the repository root:</w:t>
@@ -2320,8 +2366,8 @@
         <w:t xml:space="preserve">an archived deck keeps the ones it was built with.</w:t>
       </w:r>
     </w:p>
-    <w:bookmarkEnd w:id="12"/>
-    <w:bookmarkStart w:id="13" w:name="settings"/>
+    <w:bookmarkEnd w:id="13"/>
+    <w:bookmarkStart w:id="14" w:name="settings"/>
     <w:p>
       <w:pPr>
         <w:pStyle w:val="Heading3"/>
@@ -3183,8 +3229,8 @@
         <w:t xml:space="preserve">typo does.</w:t>
       </w:r>
     </w:p>
-    <w:bookmarkEnd w:id="13"/>
-    <w:bookmarkStart w:id="14" w:name="checking-a-deck-before-it-is-shown"/>
+    <w:bookmarkEnd w:id="14"/>
+    <w:bookmarkStart w:id="15" w:name="checking-a-deck-before-it-is-shown"/>
     <w:p>
       <w:pPr>
         <w:pStyle w:val="Heading3"/>
@@ -3435,8 +3481,8 @@
         <w:t xml:space="preserve">sections below.</w:t>
       </w:r>
     </w:p>
-    <w:bookmarkEnd w:id="14"/>
-    <w:bookmarkStart w:id="15" w:name="checking-that-the-wording-is-complete"/>
+    <w:bookmarkEnd w:id="15"/>
+    <w:bookmarkStart w:id="16" w:name="checking-that-the-wording-is-complete"/>
     <w:p>
       <w:pPr>
         <w:pStyle w:val="Heading3"/>
@@ -3514,8 +3560,8 @@
         <w:t xml:space="preserve">until someone writes a better phrase for it.</w:t>
       </w:r>
     </w:p>
-    <w:bookmarkEnd w:id="15"/>
-    <w:bookmarkStart w:id="16" w:name="Xa56e11bfac74954f54e941af4d9aa717aa2b639"/>
+    <w:bookmarkEnd w:id="16"/>
+    <w:bookmarkStart w:id="17" w:name="Xa56e11bfac74954f54e941af4d9aa717aa2b639"/>
     <w:p>
       <w:pPr>
         <w:pStyle w:val="Heading3"/>
@@ -3896,8 +3942,8 @@
         <w:t xml:space="preserve">when a dataset does.</w:t>
       </w:r>
     </w:p>
-    <w:bookmarkEnd w:id="16"/>
-    <w:bookmarkStart w:id="17" w:name="what-you-cannot-do-yet"/>
+    <w:bookmarkEnd w:id="17"/>
+    <w:bookmarkStart w:id="18" w:name="what-you-cannot-do-yet"/>
     <w:p>
       <w:pPr>
         <w:pStyle w:val="Heading3"/>
@@ -3945,9 +3991,9 @@
         </w:pict>
       </w:r>
     </w:p>
-    <w:bookmarkEnd w:id="17"/>
     <w:bookmarkEnd w:id="18"/>
-    <w:bookmarkStart w:id="28" w:name="the-deck-slide-by-slide"/>
+    <w:bookmarkEnd w:id="19"/>
+    <w:bookmarkStart w:id="29" w:name="the-deck-slide-by-slide"/>
     <w:p>
       <w:pPr>
         <w:pStyle w:val="Heading2"/>
@@ -4096,7 +4142,7 @@
         <w:t xml:space="preserve">the figure is a fitted average rather than a snapshot.</w:t>
       </w:r>
     </w:p>
-    <w:bookmarkStart w:id="19" w:name="the-two-opening-slides"/>
+    <w:bookmarkStart w:id="20" w:name="the-two-opening-slides"/>
     <w:p>
       <w:pPr>
         <w:pStyle w:val="Heading3"/>
@@ -4277,8 +4323,8 @@
         <w:t xml:space="preserve">figure in the deck reaches it and what it still costs is the restricted means.</w:t>
       </w:r>
     </w:p>
-    <w:bookmarkEnd w:id="19"/>
-    <w:bookmarkStart w:id="20" w:name="length-of-stay-per-stratifier"/>
+    <w:bookmarkEnd w:id="20"/>
+    <w:bookmarkStart w:id="21" w:name="length-of-stay-per-stratifier"/>
     <w:p>
       <w:pPr>
         <w:pStyle w:val="Heading3"/>
@@ -4414,8 +4460,8 @@
         <w:t xml:space="preserve">reversal is real.</w:t>
       </w:r>
     </w:p>
-    <w:bookmarkEnd w:id="20"/>
-    <w:bookmarkStart w:id="21" w:name="what-the-residents-still-owe"/>
+    <w:bookmarkEnd w:id="21"/>
+    <w:bookmarkStart w:id="22" w:name="what-the-residents-still-owe"/>
     <w:p>
       <w:pPr>
         <w:pStyle w:val="Heading3"/>
@@ -4636,8 +4682,8 @@
         <w:t xml:space="preserve">whole sample and then the levels of each stratifier, stacked.</w:t>
       </w:r>
     </w:p>
-    <w:bookmarkEnd w:id="21"/>
-    <w:bookmarkStart w:id="22" w:name="the-three-workload-slides"/>
+    <w:bookmarkEnd w:id="22"/>
+    <w:bookmarkStart w:id="23" w:name="the-three-workload-slides"/>
     <w:p>
       <w:pPr>
         <w:pStyle w:val="Heading3"/>
@@ -5196,8 +5242,8 @@
         <w:t xml:space="preserve">.</w:t>
       </w:r>
     </w:p>
-    <w:bookmarkEnd w:id="22"/>
-    <w:bookmarkStart w:id="23" w:name="hazard-ratios-then-length-of-stay-ratios"/>
+    <w:bookmarkEnd w:id="23"/>
+    <w:bookmarkStart w:id="24" w:name="hazard-ratios-then-length-of-stay-ratios"/>
     <w:p>
       <w:pPr>
         <w:pStyle w:val="Heading3"/>
@@ -5647,8 +5693,8 @@
         <w:t xml:space="preserve">closing sections.</w:t>
       </w:r>
     </w:p>
-    <w:bookmarkEnd w:id="23"/>
-    <w:bookmarkStart w:id="24" w:name="the-competing-risks-run"/>
+    <w:bookmarkEnd w:id="24"/>
+    <w:bookmarkStart w:id="25" w:name="the-competing-risks-run"/>
     <w:p>
       <w:pPr>
         <w:pStyle w:val="Heading3"/>
@@ -6043,8 +6089,8 @@
         <w:t xml:space="preserve">promising a breakdown is only written when there are slides to follow it.</w:t>
       </w:r>
     </w:p>
-    <w:bookmarkEnd w:id="24"/>
-    <w:bookmarkStart w:id="25" w:name="closing-sections"/>
+    <w:bookmarkEnd w:id="25"/>
+    <w:bookmarkStart w:id="26" w:name="closing-sections"/>
     <w:p>
       <w:pPr>
         <w:pStyle w:val="Heading3"/>
@@ -6173,8 +6219,8 @@
         <w:t xml:space="preserve">.</w:t>
       </w:r>
     </w:p>
-    <w:bookmarkEnd w:id="25"/>
-    <w:bookmarkStart w:id="26" w:name="speaker-notes"/>
+    <w:bookmarkEnd w:id="26"/>
+    <w:bookmarkStart w:id="27" w:name="speaker-notes"/>
     <w:p>
       <w:pPr>
         <w:pStyle w:val="Heading3"/>
@@ -6237,8 +6283,8 @@
         <w:t xml:space="preserve">hangs the set on every one of them; the closing sections de-duplicate.</w:t>
       </w:r>
     </w:p>
-    <w:bookmarkEnd w:id="26"/>
-    <w:bookmarkStart w:id="27" w:name="the-file-you-get"/>
+    <w:bookmarkEnd w:id="27"/>
+    <w:bookmarkStart w:id="28" w:name="the-file-you-get"/>
     <w:p>
       <w:pPr>
         <w:pStyle w:val="Heading3"/>
@@ -6339,9 +6385,9 @@
         </w:pict>
       </w:r>
     </w:p>
-    <w:bookmarkEnd w:id="27"/>
     <w:bookmarkEnd w:id="28"/>
-    <w:bookmarkStart w:id="42" w:name="what-the-deck-decides"/>
+    <w:bookmarkEnd w:id="29"/>
+    <w:bookmarkStart w:id="43" w:name="what-the-deck-decides"/>
     <w:p>
       <w:pPr>
         <w:pStyle w:val="Heading2"/>
@@ -6390,7 +6436,7 @@
         <w:t xml:space="preserve">is set to.</w:t>
       </w:r>
     </w:p>
-    <w:bookmarkStart w:id="29" w:name="the-opening-summary"/>
+    <w:bookmarkStart w:id="30" w:name="the-opening-summary"/>
     <w:p>
       <w:pPr>
         <w:pStyle w:val="Heading3"/>
@@ -7059,8 +7105,8 @@
         <w:t xml:space="preserve">Periods defined but never reached by a stay are left out throughout the deck.</w:t>
       </w:r>
     </w:p>
-    <w:bookmarkEnd w:id="29"/>
-    <w:bookmarkStart w:id="30" w:name="observation-gaps"/>
+    <w:bookmarkEnd w:id="30"/>
+    <w:bookmarkStart w:id="31" w:name="observation-gaps"/>
     <w:p>
       <w:pPr>
         <w:pStyle w:val="Heading3"/>
@@ -7459,8 +7505,8 @@
         <w:t xml:space="preserve">dropped.</w:t>
       </w:r>
     </w:p>
-    <w:bookmarkEnd w:id="30"/>
-    <w:bookmarkStart w:id="31" w:name="the-measures-a-slide-leads-with"/>
+    <w:bookmarkEnd w:id="31"/>
+    <w:bookmarkStart w:id="32" w:name="the-measures-a-slide-leads-with"/>
     <w:p>
       <w:pPr>
         <w:pStyle w:val="Heading3"/>
@@ -7836,8 +7882,8 @@
         <w:t xml:space="preserve">would be noise.</w:t>
       </w:r>
     </w:p>
-    <w:bookmarkEnd w:id="31"/>
-    <w:bookmarkStart w:id="32" w:name="high-low-and-flat"/>
+    <w:bookmarkEnd w:id="32"/>
+    <w:bookmarkStart w:id="33" w:name="high-low-and-flat"/>
     <w:p>
       <w:pPr>
         <w:pStyle w:val="Heading3"/>
@@ -8133,8 +8179,8 @@
         <w:t xml:space="preserve">implying a difference that is not there.</w:t>
       </w:r>
     </w:p>
-    <w:bookmarkEnd w:id="32"/>
-    <w:bookmarkStart w:id="33" w:name="which-levels-a-table-shows"/>
+    <w:bookmarkEnd w:id="33"/>
+    <w:bookmarkStart w:id="34" w:name="which-levels-a-table-shows"/>
     <w:p>
       <w:pPr>
         <w:pStyle w:val="Heading3"/>
@@ -8450,8 +8496,8 @@
         <w:t xml:space="preserve">, a selector by picking nothing, a finding by saying nothing.</w:t>
       </w:r>
     </w:p>
-    <w:bookmarkEnd w:id="33"/>
-    <w:bookmarkStart w:id="34" w:name="the-competing-risk-tables"/>
+    <w:bookmarkEnd w:id="34"/>
+    <w:bookmarkStart w:id="35" w:name="the-competing-risk-tables"/>
     <w:p>
       <w:pPr>
         <w:pStyle w:val="Heading3"/>
@@ -9002,8 +9048,8 @@
         <w:t xml:space="preserve">which the deck does not report.</w:t>
       </w:r>
     </w:p>
-    <w:bookmarkEnd w:id="34"/>
-    <w:bookmarkStart w:id="35" w:name="caveats-the-data-triggers"/>
+    <w:bookmarkEnd w:id="35"/>
+    <w:bookmarkStart w:id="36" w:name="caveats-the-data-triggers"/>
     <w:p>
       <w:pPr>
         <w:pStyle w:val="Heading3"/>
@@ -9322,8 +9368,8 @@
         <w:t xml:space="preserve">.</w:t>
       </w:r>
     </w:p>
-    <w:bookmarkEnd w:id="35"/>
-    <w:bookmarkStart w:id="36" w:name="when-the-deck-says-nothing"/>
+    <w:bookmarkEnd w:id="36"/>
+    <w:bookmarkStart w:id="37" w:name="when-the-deck-says-nothing"/>
     <w:p>
       <w:pPr>
         <w:pStyle w:val="Heading3"/>
@@ -9737,8 +9783,8 @@
         <w:t xml:space="preserve">.</w:t>
       </w:r>
     </w:p>
-    <w:bookmarkEnd w:id="36"/>
-    <w:bookmarkStart w:id="37" w:name="findings"/>
+    <w:bookmarkEnd w:id="37"/>
+    <w:bookmarkStart w:id="38" w:name="findings"/>
     <w:p>
       <w:pPr>
         <w:pStyle w:val="Heading3"/>
@@ -10662,8 +10708,8 @@
         <w:t xml:space="preserve">.</w:t>
       </w:r>
     </w:p>
-    <w:bookmarkEnd w:id="37"/>
-    <w:bookmarkStart w:id="38" w:name="recommendations"/>
+    <w:bookmarkEnd w:id="38"/>
+    <w:bookmarkStart w:id="39" w:name="recommendations"/>
     <w:p>
       <w:pPr>
         <w:pStyle w:val="Heading3"/>
@@ -12909,8 +12955,8 @@
         <w:t xml:space="preserve">planner has to rank or drop them.</w:t>
       </w:r>
     </w:p>
-    <w:bookmarkEnd w:id="38"/>
-    <w:bookmarkStart w:id="39" w:name="salience"/>
+    <w:bookmarkEnd w:id="39"/>
+    <w:bookmarkStart w:id="40" w:name="salience"/>
     <w:p>
       <w:pPr>
         <w:pStyle w:val="Heading3"/>
@@ -13372,8 +13418,8 @@
         <w:t xml:space="preserve">very few animals.</w:t>
       </w:r>
     </w:p>
-    <w:bookmarkEnd w:id="39"/>
-    <w:bookmarkStart w:id="40" w:name="the-salience-threshold"/>
+    <w:bookmarkEnd w:id="40"/>
+    <w:bookmarkStart w:id="41" w:name="the-salience-threshold"/>
     <w:p>
       <w:pPr>
         <w:pStyle w:val="Heading3"/>
@@ -14255,8 +14301,8 @@
         <w:t xml:space="preserve">it ever becomes a reported quantity.</w:t>
       </w:r>
     </w:p>
-    <w:bookmarkEnd w:id="40"/>
-    <w:bookmarkStart w:id="41" w:name="every-threshold-in-one-place"/>
+    <w:bookmarkEnd w:id="41"/>
+    <w:bookmarkStart w:id="42" w:name="every-threshold-in-one-place"/>
     <w:p>
       <w:pPr>
         <w:pStyle w:val="Heading3"/>
@@ -15138,9 +15184,9 @@
         </w:pict>
       </w:r>
     </w:p>
-    <w:bookmarkEnd w:id="41"/>
     <w:bookmarkEnd w:id="42"/>
-    <w:bookmarkStart w:id="65" w:name="extending-the-package"/>
+    <w:bookmarkEnd w:id="43"/>
+    <w:bookmarkStart w:id="66" w:name="extending-the-package"/>
     <w:p>
       <w:pPr>
         <w:pStyle w:val="Heading2"/>
@@ -15175,7 +15221,7 @@
         <w:t xml:space="preserve">build one.</w:t>
       </w:r>
     </w:p>
-    <w:bookmarkStart w:id="43" w:name="where-it-sits"/>
+    <w:bookmarkStart w:id="44" w:name="where-it-sits"/>
     <w:p>
       <w:pPr>
         <w:pStyle w:val="Heading3"/>
@@ -15530,8 +15576,8 @@
         <w:t xml:space="preserve">.</w:t>
       </w:r>
     </w:p>
-    <w:bookmarkEnd w:id="43"/>
-    <w:bookmarkStart w:id="44" w:name="reading-the-bundle"/>
+    <w:bookmarkEnd w:id="44"/>
+    <w:bookmarkStart w:id="45" w:name="reading-the-bundle"/>
     <w:p>
       <w:pPr>
         <w:pStyle w:val="Heading3"/>
@@ -15936,8 +15982,8 @@
         <w:t xml:space="preserve">cannot drift from it.</w:t>
       </w:r>
     </w:p>
-    <w:bookmarkEnd w:id="44"/>
-    <w:bookmarkStart w:id="47" w:name="the-regression-frames"/>
+    <w:bookmarkEnd w:id="45"/>
+    <w:bookmarkStart w:id="48" w:name="the-regression-frames"/>
     <w:p>
       <w:pPr>
         <w:pStyle w:val="Heading3"/>
@@ -16262,7 +16308,7 @@
         <w:t xml:space="preserve">a deck’s animal groups two different ways on consecutive slides.</w:t>
       </w:r>
     </w:p>
-    <w:bookmarkStart w:id="45" w:name="two-comparisons-kept-apart"/>
+    <w:bookmarkStart w:id="46" w:name="two-comparisons-kept-apart"/>
     <w:p>
       <w:pPr>
         <w:pStyle w:val="Heading4"/>
@@ -16723,8 +16769,8 @@
         <w:t xml:space="preserve">the uncertainty.</w:t>
       </w:r>
     </w:p>
-    <w:bookmarkEnd w:id="45"/>
-    <w:bookmarkStart w:id="46" w:name="why-this-one-file-derives"/>
+    <w:bookmarkEnd w:id="46"/>
+    <w:bookmarkStart w:id="47" w:name="why-this-one-file-derives"/>
     <w:p>
       <w:pPr>
         <w:pStyle w:val="Heading4"/>
@@ -16793,9 +16839,9 @@
         <w:t xml:space="preserve">or to be cited as a separate finding, then it should move into R.</w:t>
       </w:r>
     </w:p>
-    <w:bookmarkEnd w:id="46"/>
     <w:bookmarkEnd w:id="47"/>
-    <w:bookmarkStart w:id="53" w:name="display-names"/>
+    <w:bookmarkEnd w:id="48"/>
+    <w:bookmarkStart w:id="54" w:name="display-names"/>
     <w:p>
       <w:pPr>
         <w:pStyle w:val="Heading3"/>
@@ -16872,7 +16918,7 @@
         <w:t xml:space="preserve">and the CSVs.</w:t>
       </w:r>
     </w:p>
-    <w:bookmarkStart w:id="48" w:name="conventions"/>
+    <w:bookmarkStart w:id="49" w:name="conventions"/>
     <w:p>
       <w:pPr>
         <w:pStyle w:val="Heading4"/>
@@ -17088,8 +17134,8 @@
         <w:t xml:space="preserve">views side by side and they diverge hard.</w:t>
       </w:r>
     </w:p>
-    <w:bookmarkEnd w:id="48"/>
-    <w:bookmarkStart w:id="49" w:name="entry-shape"/>
+    <w:bookmarkEnd w:id="49"/>
+    <w:bookmarkStart w:id="50" w:name="entry-shape"/>
     <w:p>
       <w:pPr>
         <w:pStyle w:val="Heading4"/>
@@ -17198,8 +17244,8 @@
         <w:t xml:space="preserve">.</w:t>
       </w:r>
     </w:p>
-    <w:bookmarkEnd w:id="49"/>
-    <w:bookmarkStart w:id="50" w:name="three-namespaces"/>
+    <w:bookmarkEnd w:id="50"/>
+    <w:bookmarkStart w:id="51" w:name="three-namespaces"/>
     <w:p>
       <w:pPr>
         <w:pStyle w:val="Heading4"/>
@@ -17427,8 +17473,8 @@
         </w:tc>
       </w:tr>
     </w:tbl>
-    <w:bookmarkEnd w:id="50"/>
-    <w:bookmarkStart w:id="51" w:name="three-structural-rules"/>
+    <w:bookmarkEnd w:id="51"/>
+    <w:bookmarkStart w:id="52" w:name="three-structural-rules"/>
     <w:p>
       <w:pPr>
         <w:pStyle w:val="Heading4"/>
@@ -17724,8 +17770,8 @@
         <w:t xml:space="preserve">for it.</w:t>
       </w:r>
     </w:p>
-    <w:bookmarkEnd w:id="51"/>
-    <w:bookmarkStart w:id="52" w:name="the-fallback"/>
+    <w:bookmarkEnd w:id="52"/>
+    <w:bookmarkStart w:id="53" w:name="the-fallback"/>
     <w:p>
       <w:pPr>
         <w:pStyle w:val="Heading4"/>
@@ -17816,9 +17862,9 @@
         <w:t xml:space="preserve">outcome-code segments, which are user configuration and uppercase-initial.</w:t>
       </w:r>
     </w:p>
-    <w:bookmarkEnd w:id="52"/>
     <w:bookmarkEnd w:id="53"/>
-    <w:bookmarkStart w:id="55" w:name="content-blocks"/>
+    <w:bookmarkEnd w:id="54"/>
+    <w:bookmarkStart w:id="56" w:name="content-blocks"/>
     <w:p>
       <w:pPr>
         <w:pStyle w:val="Heading3"/>
@@ -17874,7 +17920,7 @@
         <w:t xml:space="preserve">was added to the bundle rather than recomputed here.</w:t>
       </w:r>
     </w:p>
-    <w:bookmarkStart w:id="54" w:name="table"/>
+    <w:bookmarkStart w:id="55" w:name="table"/>
     <w:p>
       <w:pPr>
         <w:pStyle w:val="Heading4"/>
@@ -18152,9 +18198,9 @@
         <w:t xml:space="preserve">own. The footnote is there for the reader who needs it.</w:t>
       </w:r>
     </w:p>
-    <w:bookmarkEnd w:id="54"/>
     <w:bookmarkEnd w:id="55"/>
-    <w:bookmarkStart w:id="56" w:name="slide-rules"/>
+    <w:bookmarkEnd w:id="56"/>
+    <w:bookmarkStart w:id="57" w:name="slide-rules"/>
     <w:p>
       <w:pPr>
         <w:pStyle w:val="Heading3"/>
@@ -18793,8 +18839,8 @@
         <w:t xml:space="preserve">survivor runs full width; with both missing the table still carries the slide.</w:t>
       </w:r>
     </w:p>
-    <w:bookmarkEnd w:id="56"/>
-    <w:bookmarkStart w:id="57" w:name="the-deck-plan"/>
+    <w:bookmarkEnd w:id="57"/>
+    <w:bookmarkStart w:id="58" w:name="the-deck-plan"/>
     <w:p>
       <w:pPr>
         <w:pStyle w:val="Heading3"/>
@@ -18874,8 +18920,8 @@
         <w:t xml:space="preserve">application makes the last rule pay for everything the earlier ones spent.</w:t>
       </w:r>
     </w:p>
-    <w:bookmarkEnd w:id="57"/>
-    <w:bookmarkStart w:id="58" w:name="figures-this-package-draws"/>
+    <w:bookmarkEnd w:id="58"/>
+    <w:bookmarkStart w:id="59" w:name="figures-this-package-draws"/>
     <w:p>
       <w:pPr>
         <w:pStyle w:val="Heading3"/>
@@ -19190,8 +19236,8 @@
         <w:t xml:space="preserve">, the figure having less width to spare.</w:t>
       </w:r>
     </w:p>
-    <w:bookmarkEnd w:id="58"/>
-    <w:bookmarkStart w:id="59" w:name="renderers"/>
+    <w:bookmarkEnd w:id="59"/>
+    <w:bookmarkStart w:id="60" w:name="renderers"/>
     <w:p>
       <w:pPr>
         <w:pStyle w:val="Heading3"/>
@@ -20293,8 +20339,8 @@
         <w:t xml:space="preserve">entry.</w:t>
       </w:r>
     </w:p>
-    <w:bookmarkEnd w:id="59"/>
-    <w:bookmarkStart w:id="62" w:name="everything-a-build-writes"/>
+    <w:bookmarkEnd w:id="60"/>
+    <w:bookmarkStart w:id="63" w:name="everything-a-build-writes"/>
     <w:p>
       <w:pPr>
         <w:pStyle w:val="Heading3"/>
@@ -20597,7 +20643,7 @@
         <w:t xml:space="preserve">deck keeps the ones it was built with and nothing is lost by redrawing them.</w:t>
       </w:r>
     </w:p>
-    <w:bookmarkStart w:id="60" w:name="the-figure-manifest"/>
+    <w:bookmarkStart w:id="61" w:name="the-figure-manifest"/>
     <w:p>
       <w:pPr>
         <w:pStyle w:val="Heading4"/>
@@ -20704,8 +20750,8 @@
         <w:t xml:space="preserve">manifest exists.</w:t>
       </w:r>
     </w:p>
-    <w:bookmarkEnd w:id="60"/>
-    <w:bookmarkStart w:id="61" w:name="what-gets-a-sheet"/>
+    <w:bookmarkEnd w:id="61"/>
+    <w:bookmarkStart w:id="62" w:name="what-gets-a-sheet"/>
     <w:p>
       <w:pPr>
         <w:pStyle w:val="Heading4"/>
@@ -21292,9 +21338,9 @@
         <w:t xml:space="preserve">sort the column, or chart it, none of which a pre-rounded string allows.</w:t>
       </w:r>
     </w:p>
-    <w:bookmarkEnd w:id="61"/>
     <w:bookmarkEnd w:id="62"/>
-    <w:bookmarkStart w:id="63" w:name="invariants"/>
+    <w:bookmarkEnd w:id="63"/>
+    <w:bookmarkStart w:id="64" w:name="invariants"/>
     <w:p>
       <w:pPr>
         <w:pStyle w:val="Heading3"/>
@@ -21659,8 +21705,8 @@
         <w:t xml:space="preserve">selectively disabled outputs.</w:t>
       </w:r>
     </w:p>
-    <w:bookmarkEnd w:id="63"/>
-    <w:bookmarkStart w:id="64" w:name="running-the-pieces"/>
+    <w:bookmarkEnd w:id="64"/>
+    <w:bookmarkStart w:id="65" w:name="running-the-pieces"/>
     <w:p>
       <w:pPr>
         <w:pStyle w:val="Heading3"/>
@@ -22601,9 +22647,9 @@
         </w:pict>
       </w:r>
     </w:p>
-    <w:bookmarkEnd w:id="64"/>
     <w:bookmarkEnd w:id="65"/>
-    <w:bookmarkStart w:id="66" w:name="design-decisions-and-why"/>
+    <w:bookmarkEnd w:id="66"/>
+    <w:bookmarkStart w:id="67" w:name="design-decisions-and-why"/>
     <w:p>
       <w:pPr>
         <w:pStyle w:val="Heading2"/>
@@ -22805,8 +22851,8 @@
         </w:pict>
       </w:r>
     </w:p>
-    <w:bookmarkEnd w:id="66"/>
-    <w:bookmarkStart w:id="67" w:name="known-gaps"/>
+    <w:bookmarkEnd w:id="67"/>
+    <w:bookmarkStart w:id="68" w:name="known-gaps"/>
     <w:p>
       <w:pPr>
         <w:pStyle w:val="Heading2"/>
@@ -23317,8 +23363,8 @@
         <w:t xml:space="preserve">The report and spreadsheet renderers do not exist.</w:t>
       </w:r>
     </w:p>
-    <w:bookmarkEnd w:id="67"/>
     <w:bookmarkEnd w:id="68"/>
+    <w:bookmarkEnd w:id="69"/>
     <w:sectPr>
       <w:footnotePr>
         <w:numRestart w:val="eachSect"/>

</xml_diff>

<commit_message>
Point the deck citations at version 2
The deck deposit was re-issued as version 2, 10.5281/zenodo.22135419, to
correct the Workload_By_Stratum column headers. Every live pointer to "the
deck deposit" now names it: README's citing table, presentation_guide, and
the note in CITATION.cff that explains why the deck is not listed there.

CHANGELOG is deliberately untouched. Its mention sits under 0.1.1, and a
released section records what was true at that release; repointing it would
falsify the history it exists to keep.

The identifier table gains row 15 and its counts move from fourteen to
fifteen. Presentation guide stamped 20260828_001 and its Word export rebuilt.

Assisted-by: Claude Opus 5
</commit_message>
<xml_diff>
--- a/presentation_guide.docx
+++ b/presentation_guide.docx
@@ -34,7 +34,7 @@
           <w:i/>
           <w:iCs/>
         </w:rPr>
-        <w:t xml:space="preserve">presentation guide, version 20260827_002. Read it in any markdown reader,</w:t>
+        <w:t xml:space="preserve">presentation guide, version 20260828_001. Read it in any markdown reader,</w:t>
       </w:r>
       <w:r>
         <w:rPr>
@@ -160,7 +160,7 @@
           <w:i/>
           <w:iCs/>
         </w:rPr>
-        <w:t xml:space="preserve">at commit ac335b5 (2026-08-27). Where that is not the newest commit touching the file, this Word copy is behind it.</w:t>
+        <w:t xml:space="preserve">at commit ac335b5, plus uncommitted changes (2026-08-27). Where that is not the newest commit touching the file, this Word copy is behind it.</w:t>
       </w:r>
     </w:p>
     <w:p>
@@ -2009,7 +2009,7 @@
           <w:rPr>
             <w:rStyle w:val="Hyperlink"/>
           </w:rPr>
-          <w:t xml:space="preserve">10.5281/zenodo.22085157</w:t>
+          <w:t xml:space="preserve">10.5281/zenodo.22135419</w:t>
         </w:r>
       </w:hyperlink>
       <w:r>

</xml_diff>

<commit_message>
Close out 0.2.1, catching the DOIs 0.2.0 minted
Results version 2 and deck version 3 did not exist when 0.2.0 was archived,
so a second release names them: CITATION.cff, README.md and
presentation_guide.md.

The identifier table gains four rows, one of them mLOS 0.1.2, whose version
DOI it had never recorded.  Nineteen now, each read off Zenodo rather than
copied forward.  Rows 14 and 18 keep the superseded deposit versions, which is
what a table of every identifier is for.

Step 7 gives the deck deposit's type as Presentation, which is what the
records carry, and warns about the New Version metadata carry-forward.  Deck
version 3 published with is-derived-from still naming results version 1: it
resolved, it was a results DOI, and it was wrong, so only a reading of the
published record found it.

Assisted-by: Claude Opus 5 <noreply@anthropic.com>
</commit_message>
<xml_diff>
--- a/presentation_guide.docx
+++ b/presentation_guide.docx
@@ -34,7 +34,7 @@
           <w:i/>
           <w:iCs/>
         </w:rPr>
-        <w:t xml:space="preserve">presentation guide, version 20260906_001. Read it in any markdown reader,</w:t>
+        <w:t xml:space="preserve">presentation guide, version 20260908_001. Read it in any markdown reader,</w:t>
       </w:r>
       <w:r>
         <w:rPr>
@@ -160,7 +160,7 @@
           <w:i/>
           <w:iCs/>
         </w:rPr>
-        <w:t xml:space="preserve">at commit 6cdd5d4 (2026-09-06). Where that is not the newest commit touching the file, this Word copy is behind it.</w:t>
+        <w:t xml:space="preserve">at commit cc31ac9 (2026-09-07). Where that is not the newest commit touching the file, this Word copy is behind it.</w:t>
       </w:r>
     </w:p>
     <w:p>
@@ -2125,7 +2125,7 @@
           <w:rPr>
             <w:rStyle w:val="Hyperlink"/>
           </w:rPr>
-          <w:t xml:space="preserve">10.5281/zenodo.22135419</w:t>
+          <w:t xml:space="preserve">10.5281/zenodo.22652329</w:t>
         </w:r>
       </w:hyperlink>
       <w:r>

</xml_diff>